<commit_message>
Updating description of the project
</commit_message>
<xml_diff>
--- a/Описание_проекта.docx
+++ b/Описание_проекта.docx
@@ -110,23 +110,31 @@
       <w:r>
         <w:t xml:space="preserve"> </w:t>
       </w:r>
-      <w:fldSimple w:instr=" SEQ Рисунок \* ARABIC ">
-        <w:r>
-          <w:rPr>
-            <w:noProof/>
-          </w:rPr>
-          <w:t>1</w:t>
-        </w:r>
-      </w:fldSimple>
-    </w:p>
-    <w:p>
-      <w:r>
-        <w:t>Модулирующий сигнал представляет собой последовательность би</w:t>
-      </w:r>
-      <w:bookmarkStart w:id="0" w:name="_GoBack"/>
-      <w:bookmarkEnd w:id="0"/>
-      <w:r>
-        <w:t xml:space="preserve">тов (0 и 1). В данной схеме для демонстрации результатов работы модема в качестве источника модулирующего сигнала выступает генератор прямоугольных сигналов. </w:t>
+      <w:r>
+        <w:fldChar w:fldCharType="begin"/>
+      </w:r>
+      <w:r>
+        <w:instrText xml:space="preserve"> SEQ Рисунок \* ARABIC </w:instrText>
+      </w:r>
+      <w:r>
+        <w:fldChar w:fldCharType="separate"/>
+      </w:r>
+      <w:r>
+        <w:rPr>
+          <w:noProof/>
+        </w:rPr>
+        <w:t>1</w:t>
+      </w:r>
+      <w:r>
+        <w:rPr>
+          <w:noProof/>
+        </w:rPr>
+        <w:fldChar w:fldCharType="end"/>
+      </w:r>
+    </w:p>
+    <w:p>
+      <w:r>
+        <w:t xml:space="preserve">Модулирующий сигнал представляет собой последовательность битов (0 и 1). В данной схеме для демонстрации результатов работы модема в качестве источника модулирующего сигнала выступает генератор прямоугольных сигналов. </w:t>
       </w:r>
       <w:r>
         <w:t>Для удобства симуляции сигнал с модулятора сразу подаётся на демодулятор.</w:t>
@@ -658,7 +666,10 @@
         <w:t xml:space="preserve">‘1’ </w:t>
       </w:r>
       <w:r>
-        <w:t xml:space="preserve">модулирующий сигнал представляет собой </w:t>
+        <w:t>модулированный</w:t>
+      </w:r>
+      <w:r>
+        <w:t xml:space="preserve"> сигнал представляет собой </w:t>
       </w:r>
       <w:proofErr w:type="spellStart"/>
       <w:r>
@@ -762,7 +773,10 @@
         <w:t xml:space="preserve"> </w:t>
       </w:r>
       <w:r>
-        <w:t xml:space="preserve">модулирующий сигнал представляет собой </w:t>
+        <w:t xml:space="preserve">модулированный </w:t>
+      </w:r>
+      <w:r>
+        <w:t xml:space="preserve">сигнал представляет собой </w:t>
       </w:r>
       <w:proofErr w:type="spellStart"/>
       <w:r>
@@ -835,6 +849,8 @@
           </m:sub>
         </m:sSub>
       </m:oMath>
+      <w:bookmarkStart w:id="0" w:name="_GoBack"/>
+      <w:bookmarkEnd w:id="0"/>
     </w:p>
     <w:p>
       <w:pPr>
@@ -927,14 +943,27 @@
       <w:r>
         <w:t xml:space="preserve"> </w:t>
       </w:r>
-      <w:fldSimple w:instr=" SEQ Рисунок \* ARABIC ">
-        <w:r>
-          <w:rPr>
-            <w:noProof/>
-          </w:rPr>
-          <w:t>2</w:t>
-        </w:r>
-      </w:fldSimple>
+      <w:r>
+        <w:fldChar w:fldCharType="begin"/>
+      </w:r>
+      <w:r>
+        <w:instrText xml:space="preserve"> SEQ Рисунок \* ARABIC </w:instrText>
+      </w:r>
+      <w:r>
+        <w:fldChar w:fldCharType="separate"/>
+      </w:r>
+      <w:r>
+        <w:rPr>
+          <w:noProof/>
+        </w:rPr>
+        <w:t>2</w:t>
+      </w:r>
+      <w:r>
+        <w:rPr>
+          <w:noProof/>
+        </w:rPr>
+        <w:fldChar w:fldCharType="end"/>
+      </w:r>
     </w:p>
     <w:p>
       <w:pPr>
@@ -1199,14 +1228,27 @@
       <w:r>
         <w:t xml:space="preserve"> </w:t>
       </w:r>
-      <w:fldSimple w:instr=" SEQ Рисунок \* ARABIC ">
-        <w:r>
-          <w:rPr>
-            <w:noProof/>
-          </w:rPr>
-          <w:t>3</w:t>
-        </w:r>
-      </w:fldSimple>
+      <w:r>
+        <w:fldChar w:fldCharType="begin"/>
+      </w:r>
+      <w:r>
+        <w:instrText xml:space="preserve"> SEQ Рисунок \* ARABIC </w:instrText>
+      </w:r>
+      <w:r>
+        <w:fldChar w:fldCharType="separate"/>
+      </w:r>
+      <w:r>
+        <w:rPr>
+          <w:noProof/>
+        </w:rPr>
+        <w:t>3</w:t>
+      </w:r>
+      <w:r>
+        <w:rPr>
+          <w:noProof/>
+        </w:rPr>
+        <w:fldChar w:fldCharType="end"/>
+      </w:r>
     </w:p>
     <w:p>
       <w:r>
@@ -1270,14 +1312,27 @@
       <w:r>
         <w:t xml:space="preserve"> </w:t>
       </w:r>
-      <w:fldSimple w:instr=" SEQ Рисунок \* ARABIC ">
-        <w:r>
-          <w:rPr>
-            <w:noProof/>
-          </w:rPr>
-          <w:t>4</w:t>
-        </w:r>
-      </w:fldSimple>
+      <w:r>
+        <w:fldChar w:fldCharType="begin"/>
+      </w:r>
+      <w:r>
+        <w:instrText xml:space="preserve"> SEQ Рисунок \* ARABIC </w:instrText>
+      </w:r>
+      <w:r>
+        <w:fldChar w:fldCharType="separate"/>
+      </w:r>
+      <w:r>
+        <w:rPr>
+          <w:noProof/>
+        </w:rPr>
+        <w:t>4</w:t>
+      </w:r>
+      <w:r>
+        <w:rPr>
+          <w:noProof/>
+        </w:rPr>
+        <w:fldChar w:fldCharType="end"/>
+      </w:r>
     </w:p>
     <w:p>
       <w:r>
@@ -1292,96 +1347,87 @@
         <w:t>На</w:t>
       </w:r>
       <w:r>
-        <w:rPr>
-          <w:lang w:val="en-US"/>
-        </w:rPr>
         <w:t xml:space="preserve"> </w:t>
       </w:r>
       <w:r>
         <w:t>рис</w:t>
       </w:r>
       <w:r>
-        <w:rPr>
-          <w:lang w:val="en-US"/>
-        </w:rPr>
-        <w:t>. 5</w:t>
-      </w:r>
-      <w:r>
-        <w:rPr>
-          <w:lang w:val="en-US"/>
-        </w:rPr>
-        <w:t xml:space="preserve"> </w:t>
+        <w:t xml:space="preserve">. 5 </w:t>
       </w:r>
       <w:r>
         <w:t>приведены</w:t>
       </w:r>
       <w:r>
-        <w:rPr>
-          <w:lang w:val="en-US"/>
-        </w:rPr>
         <w:t xml:space="preserve"> </w:t>
       </w:r>
       <w:r>
         <w:t>осциллограммы</w:t>
       </w:r>
       <w:r>
-        <w:rPr>
-          <w:lang w:val="en-US"/>
-        </w:rPr>
         <w:t xml:space="preserve">, </w:t>
       </w:r>
       <w:r>
         <w:t>снятые</w:t>
       </w:r>
       <w:r>
-        <w:rPr>
-          <w:lang w:val="en-US"/>
-        </w:rPr>
         <w:t xml:space="preserve"> </w:t>
       </w:r>
       <w:r>
         <w:t>с</w:t>
       </w:r>
       <w:r>
-        <w:rPr>
-          <w:lang w:val="en-US"/>
-        </w:rPr>
         <w:t xml:space="preserve"> </w:t>
       </w:r>
       <w:r>
         <w:t>осциллографов</w:t>
       </w:r>
       <w:r>
-        <w:rPr>
-          <w:lang w:val="en-US"/>
-        </w:rPr>
-        <w:t xml:space="preserve"> modulating signal scope (</w:t>
+        <w:t xml:space="preserve"> </w:t>
+      </w:r>
+      <w:r>
+        <w:rPr>
+          <w:lang w:val="en-US"/>
+        </w:rPr>
+        <w:t>modulating</w:t>
+      </w:r>
+      <w:r>
+        <w:t xml:space="preserve"> </w:t>
+      </w:r>
+      <w:r>
+        <w:rPr>
+          <w:lang w:val="en-US"/>
+        </w:rPr>
+        <w:t>signal</w:t>
+      </w:r>
+      <w:r>
+        <w:t xml:space="preserve"> </w:t>
+      </w:r>
+      <w:r>
+        <w:rPr>
+          <w:lang w:val="en-US"/>
+        </w:rPr>
+        <w:t>scope</w:t>
+      </w:r>
+      <w:r>
+        <w:t xml:space="preserve"> (</w:t>
       </w:r>
       <w:r>
         <w:t>верхняя</w:t>
       </w:r>
       <w:r>
-        <w:rPr>
-          <w:lang w:val="en-US"/>
-        </w:rPr>
         <w:t xml:space="preserve"> </w:t>
       </w:r>
       <w:r>
         <w:t>осциллограмма</w:t>
       </w:r>
       <w:r>
-        <w:rPr>
-          <w:lang w:val="en-US"/>
-        </w:rPr>
         <w:t xml:space="preserve">) </w:t>
       </w:r>
       <w:r>
         <w:t>и</w:t>
       </w:r>
       <w:r>
-        <w:rPr>
-          <w:lang w:val="en-US"/>
-        </w:rPr>
         <w:t xml:space="preserve"> </w:t>
       </w:r>
       <w:r>
@@ -1391,40 +1437,37 @@
         <w:t>demodulated</w:t>
       </w:r>
       <w:r>
-        <w:rPr>
-          <w:lang w:val="en-US"/>
-        </w:rPr>
-        <w:t xml:space="preserve"> signal scope</w:t>
-      </w:r>
-      <w:r>
-        <w:rPr>
-          <w:lang w:val="en-US"/>
-        </w:rPr>
+        <w:t xml:space="preserve"> </w:t>
+      </w:r>
+      <w:r>
+        <w:rPr>
+          <w:lang w:val="en-US"/>
+        </w:rPr>
+        <w:t>signal</w:t>
+      </w:r>
+      <w:r>
+        <w:t xml:space="preserve"> </w:t>
+      </w:r>
+      <w:r>
+        <w:rPr>
+          <w:lang w:val="en-US"/>
+        </w:rPr>
+        <w:t>scope</w:t>
+      </w:r>
+      <w:r>
         <w:t xml:space="preserve"> (</w:t>
       </w:r>
       <w:r>
         <w:t>нижняя</w:t>
       </w:r>
       <w:r>
-        <w:rPr>
-          <w:lang w:val="en-US"/>
-        </w:rPr>
         <w:t xml:space="preserve"> </w:t>
       </w:r>
       <w:r>
         <w:t>осциллограмма</w:t>
       </w:r>
       <w:r>
-        <w:rPr>
-          <w:lang w:val="en-US"/>
-        </w:rPr>
-        <w:t>).</w:t>
-      </w:r>
-      <w:r>
-        <w:rPr>
-          <w:lang w:val="en-US"/>
-        </w:rPr>
-        <w:t xml:space="preserve"> </w:t>
+        <w:t xml:space="preserve">). </w:t>
       </w:r>
       <w:r>
         <w:t xml:space="preserve">Демодулятор выдает на выходе значение передаваемого бита </w:t>
@@ -1514,14 +1557,27 @@
       <w:r>
         <w:t xml:space="preserve"> </w:t>
       </w:r>
-      <w:fldSimple w:instr=" SEQ Рисунок \* ARABIC ">
-        <w:r>
-          <w:rPr>
-            <w:noProof/>
-          </w:rPr>
-          <w:t>5</w:t>
-        </w:r>
-      </w:fldSimple>
+      <w:r>
+        <w:fldChar w:fldCharType="begin"/>
+      </w:r>
+      <w:r>
+        <w:instrText xml:space="preserve"> SEQ Рисунок \* ARABIC </w:instrText>
+      </w:r>
+      <w:r>
+        <w:fldChar w:fldCharType="separate"/>
+      </w:r>
+      <w:r>
+        <w:rPr>
+          <w:noProof/>
+        </w:rPr>
+        <w:t>5</w:t>
+      </w:r>
+      <w:r>
+        <w:rPr>
+          <w:noProof/>
+        </w:rPr>
+        <w:fldChar w:fldCharType="end"/>
+      </w:r>
     </w:p>
     <w:p/>
     <w:p>
@@ -1664,14 +1720,27 @@
       <w:r>
         <w:t xml:space="preserve"> </w:t>
       </w:r>
-      <w:fldSimple w:instr=" SEQ Рисунок \* ARABIC ">
-        <w:r>
-          <w:rPr>
-            <w:noProof/>
-          </w:rPr>
-          <w:t>6</w:t>
-        </w:r>
-      </w:fldSimple>
+      <w:r>
+        <w:fldChar w:fldCharType="begin"/>
+      </w:r>
+      <w:r>
+        <w:instrText xml:space="preserve"> SEQ Рисунок \* ARABIC </w:instrText>
+      </w:r>
+      <w:r>
+        <w:fldChar w:fldCharType="separate"/>
+      </w:r>
+      <w:r>
+        <w:rPr>
+          <w:noProof/>
+        </w:rPr>
+        <w:t>6</w:t>
+      </w:r>
+      <w:r>
+        <w:rPr>
+          <w:noProof/>
+        </w:rPr>
+        <w:fldChar w:fldCharType="end"/>
+      </w:r>
     </w:p>
     <w:p>
       <w:pPr>
@@ -1745,14 +1814,27 @@
       <w:r>
         <w:t xml:space="preserve"> </w:t>
       </w:r>
-      <w:fldSimple w:instr=" SEQ Рисунок \* ARABIC ">
-        <w:r>
-          <w:rPr>
-            <w:noProof/>
-          </w:rPr>
-          <w:t>7</w:t>
-        </w:r>
-      </w:fldSimple>
+      <w:r>
+        <w:fldChar w:fldCharType="begin"/>
+      </w:r>
+      <w:r>
+        <w:instrText xml:space="preserve"> SEQ Рисунок \* ARABIC </w:instrText>
+      </w:r>
+      <w:r>
+        <w:fldChar w:fldCharType="separate"/>
+      </w:r>
+      <w:r>
+        <w:rPr>
+          <w:noProof/>
+        </w:rPr>
+        <w:t>7</w:t>
+      </w:r>
+      <w:r>
+        <w:rPr>
+          <w:noProof/>
+        </w:rPr>
+        <w:fldChar w:fldCharType="end"/>
+      </w:r>
     </w:p>
     <w:p>
       <w:pPr>
@@ -1804,9 +1886,6 @@
     <w:p>
       <w:pPr>
         <w:pStyle w:val="a8"/>
-        <w:rPr>
-          <w:lang w:val="en-US"/>
-        </w:rPr>
       </w:pPr>
       <w:r>
         <w:t>Рис.</w:t>
@@ -1814,22 +1893,32 @@
       <w:r>
         <w:t xml:space="preserve"> </w:t>
       </w:r>
-      <w:fldSimple w:instr=" SEQ Рисунок \* ARABIC ">
-        <w:r>
-          <w:rPr>
-            <w:noProof/>
-          </w:rPr>
-          <w:t>8</w:t>
-        </w:r>
-      </w:fldSimple>
+      <w:r>
+        <w:fldChar w:fldCharType="begin"/>
+      </w:r>
+      <w:r>
+        <w:instrText xml:space="preserve"> SEQ Рисунок \* ARABIC </w:instrText>
+      </w:r>
+      <w:r>
+        <w:fldChar w:fldCharType="separate"/>
+      </w:r>
+      <w:r>
+        <w:rPr>
+          <w:noProof/>
+        </w:rPr>
+        <w:t>8</w:t>
+      </w:r>
+      <w:r>
+        <w:rPr>
+          <w:noProof/>
+        </w:rPr>
+        <w:fldChar w:fldCharType="end"/>
+      </w:r>
     </w:p>
     <w:p/>
     <w:p>
       <w:pPr>
         <w:pStyle w:val="1"/>
-        <w:rPr>
-          <w:lang w:val="en-US"/>
-        </w:rPr>
       </w:pPr>
       <w:r>
         <w:t xml:space="preserve">Синтез модулятора и демодулятора </w:t>
@@ -2157,14 +2246,27 @@
       <w:r>
         <w:t xml:space="preserve"> </w:t>
       </w:r>
-      <w:fldSimple w:instr=" SEQ Рисунок \* ARABIC ">
-        <w:r>
-          <w:rPr>
-            <w:noProof/>
-          </w:rPr>
-          <w:t>9</w:t>
-        </w:r>
-      </w:fldSimple>
+      <w:r>
+        <w:fldChar w:fldCharType="begin"/>
+      </w:r>
+      <w:r>
+        <w:instrText xml:space="preserve"> SEQ Рисунок \* ARABIC </w:instrText>
+      </w:r>
+      <w:r>
+        <w:fldChar w:fldCharType="separate"/>
+      </w:r>
+      <w:r>
+        <w:rPr>
+          <w:noProof/>
+        </w:rPr>
+        <w:t>9</w:t>
+      </w:r>
+      <w:r>
+        <w:rPr>
+          <w:noProof/>
+        </w:rPr>
+        <w:fldChar w:fldCharType="end"/>
+      </w:r>
     </w:p>
     <w:p>
       <w:pPr>
@@ -2228,14 +2330,27 @@
       <w:r>
         <w:t xml:space="preserve"> </w:t>
       </w:r>
-      <w:fldSimple w:instr=" SEQ Рисунок \* ARABIC ">
-        <w:r>
-          <w:rPr>
-            <w:noProof/>
-          </w:rPr>
-          <w:t>10</w:t>
-        </w:r>
-      </w:fldSimple>
+      <w:r>
+        <w:fldChar w:fldCharType="begin"/>
+      </w:r>
+      <w:r>
+        <w:instrText xml:space="preserve"> SEQ Рисунок \* ARABIC </w:instrText>
+      </w:r>
+      <w:r>
+        <w:fldChar w:fldCharType="separate"/>
+      </w:r>
+      <w:r>
+        <w:rPr>
+          <w:noProof/>
+        </w:rPr>
+        <w:t>10</w:t>
+      </w:r>
+      <w:r>
+        <w:rPr>
+          <w:noProof/>
+        </w:rPr>
+        <w:fldChar w:fldCharType="end"/>
+      </w:r>
     </w:p>
     <w:sectPr>
       <w:pgSz w:w="11906" w:h="16838"/>
@@ -3372,7 +3487,7 @@
 </file>
 
 <file path=customXml/itemProps1.xml><?xml version="1.0" encoding="utf-8"?>
-<ds:datastoreItem xmlns:ds="http://schemas.openxmlformats.org/officeDocument/2006/customXml" ds:itemID="{8328B324-967B-425E-8ECD-DDF25E79B85D}">
+<ds:datastoreItem xmlns:ds="http://schemas.openxmlformats.org/officeDocument/2006/customXml" ds:itemID="{C7FBEC5C-080C-4C24-BE19-BA55B1A48528}">
   <ds:schemaRefs>
     <ds:schemaRef ds:uri="http://schemas.openxmlformats.org/officeDocument/2006/bibliography"/>
   </ds:schemaRefs>

</xml_diff>